<commit_message>
Add repository link to research report
</commit_message>
<xml_diff>
--- a/docs/SCAMGUARD_VN_THUYET_MINH_EUREKA_2026.docx
+++ b/docs/SCAMGUARD_VN_THUYET_MINH_EUREKA_2026.docx
@@ -12547,7 +12547,28 @@
         <w:ind w:firstLine="567"/>
       </w:pPr>
       <w:r>
-        <w:t>Kho mã nguồn, dữ liệu công bố, schema nhãn, script huấn luyện và artefact kiểm thử: [LIÊN KẾT GITHUB ẨN DANH — BỔ SUNG SAU KHI CÔNG BỐ]. Repository công khai sẽ không chứa API key, thông tin nhận dạng tác giả, dữ liệu nhạy cảm hoặc checkpoint không có quyền phân phối. Các checkpoint lớn có thể được công bố qua release hoặc kho lưu trữ mô hình, kèm SHA256 để xác minh.</w:t>
+        <w:rPr>
+          <w:rFonts w:ascii="Times New Roman" w:hAnsi="Times New Roman"/>
+          <w:sz w:val="26"/>
+        </w:rPr>
+        <w:t xml:space="preserve">Kho mã nguồn, dữ liệu công bố, schema nhãn, script huấn luyện và artefact kiểm thử: </w:t>
+      </w:r>
+      <w:hyperlink r:id="rId15">
+        <w:r>
+          <w:rPr>
+            <w:color w:val="0563C1"/>
+            <w:rFonts w:ascii="Times New Roman" w:hAnsi="Times New Roman" w:eastAsia="Times New Roman" w:cs="Times New Roman"/>
+            <w:sz w:val="26"/>
+          </w:rPr>
+          <w:t>https://github.com/TuanAnhPhan-pika/SCAMGUARD-VN</w:t>
+        </w:r>
+      </w:hyperlink>
+      <w:r>
+        <w:rPr>
+          <w:rFonts w:ascii="Times New Roman" w:hAnsi="Times New Roman"/>
+          <w:sz w:val="26"/>
+        </w:rPr>
+        <w:t>. Repository công khai không chứa API key hoặc dữ liệu nhạy cảm. Hai checkpoint chính được công bố qua GitHub Release model-v1, kèm SHA256 để xác minh.</w:t>
       </w:r>
     </w:p>
     <w:p>

</xml_diff>